<commit_message>
Mise à jour courrier de réponse avec textes CDC
</commit_message>
<xml_diff>
--- a/packages/applications/document-builder/src/assets/docx/délai-essais-modèle-réponse.docx
+++ b/packages/applications/document-builder/src/assets/docx/délai-essais-modèle-réponse.docx
@@ -108,27 +108,7 @@
                 <w:shd w:fill="00FFFF" w:val="clear"/>
                 <w:vertAlign w:val="baseline"/>
               </w:rPr>
-              <w:t>Paris</w:t>
-            </w:r>
-            <w:r>
-              <w:rPr>
-                <w:rFonts w:eastAsia="Arial" w:cs="Arial" w:ascii="Arial" w:hAnsi="Arial"/>
-                <w:b w:val="false"/>
-                <w:i w:val="false"/>
-                <w:caps w:val="false"/>
-                <w:smallCaps w:val="false"/>
-                <w:strike w:val="false"/>
-                <w:dstrike w:val="false"/>
-                <w:color w:val="231F20"/>
-                <w:position w:val="0"/>
-                <w:sz w:val="16"/>
-                <w:sz w:val="16"/>
-                <w:szCs w:val="16"/>
-                <w:u w:val="none"/>
-                <w:shd w:fill="00FFFF" w:val="clear"/>
-                <w:vertAlign w:val="baseline"/>
-              </w:rPr>
-              <w:t>,</w:t>
+              <w:t>Paris,</w:t>
             </w:r>
             <w:r>
               <w:rPr>
@@ -189,28 +169,7 @@
                 <w:vertAlign w:val="baseline"/>
                 <w:lang w:val="fr-FR" w:eastAsia="zh-CN" w:bidi="hi-IN"/>
               </w:rPr>
-              <w:t>XX/XX/202</w:t>
-            </w:r>
-            <w:r>
-              <w:rPr>
-                <w:rFonts w:eastAsia="Arial" w:cs="Arial" w:ascii="Arial" w:hAnsi="Arial"/>
-                <w:b w:val="false"/>
-                <w:i w:val="false"/>
-                <w:caps w:val="false"/>
-                <w:smallCaps w:val="false"/>
-                <w:strike w:val="false"/>
-                <w:dstrike w:val="false"/>
-                <w:color w:val="231F20"/>
-                <w:position w:val="0"/>
-                <w:sz w:val="16"/>
-                <w:sz w:val="16"/>
-                <w:szCs w:val="16"/>
-                <w:highlight w:val="cyan"/>
-                <w:u w:val="none"/>
-                <w:vertAlign w:val="baseline"/>
-                <w:lang w:val="fr-FR" w:eastAsia="zh-CN" w:bidi="hi-IN"/>
-              </w:rPr>
-              <w:t>6</w:t>
+              <w:t>XX/XX/2026</w:t>
             </w:r>
             <w:r>
               <w:rPr>
@@ -693,20 +652,6 @@
         </w:rPr>
       </w:pPr>
       <w:r>
-        <w:rPr/>
-      </w:r>
-    </w:p>
-    <w:p>
-      <w:pPr>
-        <w:pStyle w:val="LO-normal"/>
-        <w:jc w:val="both"/>
-        <w:rPr>
-          <w:rFonts w:ascii="Liberation Sans" w:hAnsi="Liberation Sans" w:eastAsia="Liberation Sans" w:cs="Liberation Sans"/>
-          <w:sz w:val="20"/>
-          <w:szCs w:val="20"/>
-        </w:rPr>
-      </w:pPr>
-      <w:r>
         <w:rPr>
           <w:rFonts w:eastAsia="Liberation Sans" w:cs="Liberation Sans" w:ascii="Liberation Sans" w:hAnsi="Liberation Sans"/>
           <w:sz w:val="20"/>
@@ -726,7 +671,11 @@
         </w:rPr>
       </w:pPr>
       <w:r>
-        <w:rPr/>
+        <w:rPr>
+          <w:rFonts w:eastAsia="Liberation Sans" w:cs="Liberation Sans" w:ascii="Liberation Sans" w:hAnsi="Liberation Sans"/>
+          <w:sz w:val="20"/>
+          <w:szCs w:val="20"/>
+        </w:rPr>
       </w:r>
     </w:p>
     <w:tbl>
@@ -988,14 +937,18 @@
         </w:rPr>
       </w:pPr>
       <w:r>
-        <w:rPr/>
+        <w:rPr>
+          <w:rFonts w:eastAsia="Liberation Sans" w:cs="Liberation Sans" w:ascii="Liberation Sans" w:hAnsi="Liberation Sans"/>
+          <w:sz w:val="20"/>
+          <w:szCs w:val="20"/>
+        </w:rPr>
       </w:r>
     </w:p>
     <w:p>
       <w:pPr>
         <w:pStyle w:val="LO-normal"/>
         <w:spacing w:lineRule="auto" w:line="240" w:before="160" w:after="160"/>
-        <w:jc w:val="both"/>
+        <w:jc w:val="left"/>
         <w:rPr>
           <w:rFonts w:ascii="Liberation Sans" w:hAnsi="Liberation Sans" w:eastAsia="Liberation Sans" w:cs="Liberation Sans"/>
           <w:sz w:val="20"/>
@@ -1086,7 +1039,8 @@
           <w:sz w:val="20"/>
           <w:szCs w:val="20"/>
         </w:rPr>
-        <w:t xml:space="preserve"> pour la ou les raison(s) suivante(s) :  </w:t>
+        <w:t xml:space="preserve"> pour la ou les raison(s) suivante(s) : </w:t>
+        <w:br/>
       </w:r>
       <w:r>
         <w:rPr>
@@ -1117,27 +1071,10 @@
           <w:szCs w:val="20"/>
           <w:shd w:fill="auto" w:val="clear"/>
         </w:rPr>
-        <w:t> »</w:t>
-      </w:r>
-    </w:p>
-    <w:p>
-      <w:pPr>
-        <w:pStyle w:val="LO-normal"/>
-        <w:spacing w:lineRule="auto" w:line="240" w:before="160" w:after="160"/>
-        <w:jc w:val="both"/>
-        <w:rPr>
-          <w:rFonts w:ascii="Liberation Sans" w:hAnsi="Liberation Sans" w:eastAsia="Liberation Sans" w:cs="Liberation Sans"/>
-          <w:sz w:val="20"/>
-          <w:szCs w:val="20"/>
-        </w:rPr>
-      </w:pPr>
-      <w:r>
-        <w:rPr>
-          <w:rFonts w:eastAsia="Liberation Sans" w:cs="Liberation Sans" w:ascii="Liberation Sans" w:hAnsi="Liberation Sans"/>
-          <w:sz w:val="20"/>
-          <w:szCs w:val="20"/>
-        </w:rPr>
-        <w:t xml:space="preserve">Le(s) paragraphe(s) </w:t>
+        <w:t> ».</w:t>
+        <w:br/>
+        <w:br/>
+        <w:t>Le(s) paragraphe(s) {referenceTexteDelaiPhaseEssai}</w:t>
       </w:r>
       <w:r>
         <w:rPr>
@@ -1145,56 +1082,23 @@
           <w:color w:val="000000"/>
           <w:sz w:val="16"/>
           <w:szCs w:val="16"/>
-          <w:highlight w:val="yellow"/>
-        </w:rPr>
-        <w:t>XXXX</w:t>
-      </w:r>
-      <w:r>
-        <w:rPr>
-          <w:rFonts w:eastAsia="Arial" w:cs="Arial" w:ascii="Arial" w:hAnsi="Arial"/>
-          <w:color w:val="000000"/>
-          <w:sz w:val="16"/>
-          <w:szCs w:val="16"/>
+          <w:shd w:fill="auto" w:val="clear"/>
         </w:rPr>
         <w:t xml:space="preserve"> </w:t>
       </w:r>
       <w:r>
         <w:rPr>
           <w:rFonts w:eastAsia="Liberation Sans" w:cs="Liberation Sans" w:ascii="Liberation Sans" w:hAnsi="Liberation Sans"/>
+          <w:color w:val="000000"/>
           <w:sz w:val="20"/>
           <w:szCs w:val="20"/>
+          <w:shd w:fill="auto" w:val="clear"/>
         </w:rPr>
-        <w:t>du cahier des charges de l’appel d’offres cité(s) en objet indique(nt) :</w:t>
-      </w:r>
-    </w:p>
-    <w:p>
-      <w:pPr>
-        <w:pStyle w:val="LO-normal"/>
-        <w:spacing w:lineRule="auto" w:line="240" w:before="160" w:after="160"/>
-        <w:jc w:val="both"/>
-        <w:rPr>
-          <w:rFonts w:ascii="Liberation Sans" w:hAnsi="Liberation Sans" w:eastAsia="Liberation Sans" w:cs="Liberation Sans"/>
-          <w:sz w:val="20"/>
-          <w:szCs w:val="20"/>
-        </w:rPr>
-      </w:pPr>
-      <w:r>
-        <w:rPr>
-          <w:rFonts w:eastAsia="Liberation Sans" w:cs="Liberation Sans" w:ascii="Liberation Sans" w:hAnsi="Liberation Sans"/>
-          <w:sz w:val="20"/>
-          <w:szCs w:val="20"/>
-        </w:rPr>
-        <w:t>« </w:t>
-      </w:r>
-      <w:r>
-        <w:rPr>
-          <w:rFonts w:eastAsia="Arial" w:cs="Arial" w:ascii="Arial" w:hAnsi="Arial"/>
-          <w:color w:val="000000"/>
-          <w:sz w:val="16"/>
-          <w:szCs w:val="16"/>
-          <w:highlight w:val="yellow"/>
-        </w:rPr>
-        <w:t>XXXX</w:t>
+        <w:t>du cahier des charges de l’appel d’offres cité en objet indique(nt) :</w:t>
+        <w:br/>
+        <w:br/>
+        <w:t>{contenuTexteDelaiPhaseEssai}</w:t>
+        <w:br/>
       </w:r>
       <w:r>
         <w:rPr>
@@ -1204,16 +1108,8 @@
           <w:sz w:val="20"/>
           <w:szCs w:val="20"/>
         </w:rPr>
-        <w:t>. »</w:t>
+        <w:br/>
       </w:r>
-    </w:p>
-    <w:p>
-      <w:pPr>
-        <w:pStyle w:val="LO-normal"/>
-        <w:spacing w:lineRule="auto" w:line="240" w:before="160" w:after="160"/>
-        <w:jc w:val="both"/>
-        <w:rPr/>
-      </w:pPr>
       <w:r>
         <w:rPr>
           <w:rFonts w:eastAsia="Liberation Sans" w:cs="Liberation Sans" w:ascii="Liberation Sans" w:hAnsi="Liberation Sans"/>
@@ -1333,31 +1229,7 @@
           <w:highlight w:val="cyan"/>
           <w:shd w:fill="FFFF00" w:val="clear"/>
         </w:rPr>
-        <w:t xml:space="preserve">[Saisir nombre </w:t>
-      </w:r>
-      <w:r>
-        <w:rPr>
-          <w:rStyle w:val="Strong"/>
-          <w:rFonts w:eastAsia="Liberation Sans" w:cs="Liberation Sans" w:ascii="Liberation Sans" w:hAnsi="Liberation Sans"/>
-          <w:color w:val="000000"/>
-          <w:sz w:val="20"/>
-          <w:szCs w:val="20"/>
-          <w:highlight w:val="cyan"/>
-          <w:shd w:fill="FFFF00" w:val="clear"/>
-        </w:rPr>
-        <w:t>date</w:t>
-      </w:r>
-      <w:r>
-        <w:rPr>
-          <w:rStyle w:val="Strong"/>
-          <w:rFonts w:eastAsia="Liberation Sans" w:cs="Liberation Sans" w:ascii="Liberation Sans" w:hAnsi="Liberation Sans"/>
-          <w:color w:val="000000"/>
-          <w:sz w:val="20"/>
-          <w:szCs w:val="20"/>
-          <w:highlight w:val="cyan"/>
-          <w:shd w:fill="FFFF00" w:val="clear"/>
-        </w:rPr>
-        <w:t>]</w:t>
+        <w:t>[Saisir nombre date]</w:t>
       </w:r>
       <w:r>
         <w:rPr>
@@ -1478,7 +1350,7 @@
           <w:sz w:val="16"/>
           <w:szCs w:val="16"/>
         </w:rPr>
-        <w:t xml:space="preserve">Copie :  EDF OA ; </w:t>
+        <w:t xml:space="preserve">Copie :  </w:t>
       </w:r>
       <w:r>
         <w:rPr>
@@ -1490,14 +1362,6 @@
           <w:highlight w:val="cyan"/>
         </w:rPr>
         <w:t xml:space="preserve">{#enCopies} {.} ; {/enCopies} </w:t>
-      </w:r>
-      <w:r>
-        <w:rPr>
-          <w:i/>
-          <w:sz w:val="16"/>
-          <w:szCs w:val="16"/>
-        </w:rPr>
-        <w:t xml:space="preserve">; CRE </w:t>
       </w:r>
     </w:p>
     <w:p>

</xml_diff>